<commit_message>
docs: refresh print materials with complete merged branch history
</commit_message>
<xml_diff>
--- a/submission/纸质提交材料.docx
+++ b/submission/纸质提交材料.docx
@@ -2220,7 +2220,55 @@
           <w:rFonts w:ascii="Menlo" w:hAnsi="Menlo" w:eastAsia="Noto Serif CJK SC"/>
           <w:sz w:val="14"/>
         </w:rPr>
-        <w:t>* 9049b5c fix: enforce agent evidence completeness and reject corrupted inputs</w:t>
+        <w:t>*   a444c3b (HEAD -&gt; main) merge: complete Part E iterations migration and print submission</w:t>
+      </w:r>
+    </w:p>
+    <w:p>
+      <w:pPr>
+        <w:spacing w:after="0" w:line="240" w:lineRule="auto"/>
+      </w:pPr>
+      <w:r>
+        <w:rPr>
+          <w:rFonts w:ascii="Menlo" w:hAnsi="Menlo" w:eastAsia="Noto Serif CJK SC"/>
+          <w:sz w:val="14"/>
+        </w:rPr>
+        <w:t>|\</w:t>
+      </w:r>
+    </w:p>
+    <w:p>
+      <w:pPr>
+        <w:spacing w:after="0" w:line="240" w:lineRule="auto"/>
+      </w:pPr>
+      <w:r>
+        <w:rPr>
+          <w:rFonts w:ascii="Menlo" w:hAnsi="Menlo" w:eastAsia="Noto Serif CJK SC"/>
+          <w:sz w:val="14"/>
+        </w:rPr>
+        <w:t>| * b2ac383 (task-e-iterate) docs: complete migration evidence and verified submission materials</w:t>
+      </w:r>
+    </w:p>
+    <w:p>
+      <w:pPr>
+        <w:spacing w:after="0" w:line="240" w:lineRule="auto"/>
+      </w:pPr>
+      <w:r>
+        <w:rPr>
+          <w:rFonts w:ascii="Menlo" w:hAnsi="Menlo" w:eastAsia="Noto Serif CJK SC"/>
+          <w:sz w:val="14"/>
+        </w:rPr>
+        <w:t>| * 9049b5c fix: enforce agent evidence completeness and reject corrupted inputs</w:t>
+      </w:r>
+    </w:p>
+    <w:p>
+      <w:pPr>
+        <w:spacing w:after="0" w:line="240" w:lineRule="auto"/>
+      </w:pPr>
+      <w:r>
+        <w:rPr>
+          <w:rFonts w:ascii="Menlo" w:hAnsi="Menlo" w:eastAsia="Noto Serif CJK SC"/>
+          <w:sz w:val="14"/>
+        </w:rPr>
+        <w:t>|/</w:t>
       </w:r>
     </w:p>
     <w:p>
@@ -2244,7 +2292,7 @@
           <w:rFonts w:ascii="Menlo" w:hAnsi="Menlo" w:eastAsia="Noto Serif CJK SC"/>
           <w:sz w:val="14"/>
         </w:rPr>
-        <w:t xml:space="preserve">|\  </w:t>
+        <w:t>|\</w:t>
       </w:r>
     </w:p>
     <w:p>
@@ -2256,7 +2304,7 @@
           <w:rFonts w:ascii="Menlo" w:hAnsi="Menlo" w:eastAsia="Noto Serif CJK SC"/>
           <w:sz w:val="14"/>
         </w:rPr>
-        <w:t>| * 833ca6d docs: write and compile Chinese paper with verified references and bounded claims</w:t>
+        <w:t>| * 833ca6d (task-d-paper) docs: write and compile Chinese paper with verified references and bounded claims</w:t>
       </w:r>
     </w:p>
     <w:p>
@@ -2268,7 +2316,7 @@
           <w:rFonts w:ascii="Menlo" w:hAnsi="Menlo" w:eastAsia="Noto Serif CJK SC"/>
           <w:sz w:val="14"/>
         </w:rPr>
-        <w:t xml:space="preserve">|/  </w:t>
+        <w:t>|/</w:t>
       </w:r>
     </w:p>
     <w:p>
@@ -2292,7 +2340,7 @@
           <w:rFonts w:ascii="Menlo" w:hAnsi="Menlo" w:eastAsia="Noto Serif CJK SC"/>
           <w:sz w:val="14"/>
         </w:rPr>
-        <w:t xml:space="preserve">|\  </w:t>
+        <w:t>|\</w:t>
       </w:r>
     </w:p>
     <w:p>
@@ -2304,7 +2352,7 @@
           <w:rFonts w:ascii="Menlo" w:hAnsi="Menlo" w:eastAsia="Noto Serif CJK SC"/>
           <w:sz w:val="14"/>
         </w:rPr>
-        <w:t>| * 8b216e6 feat: add theme-aware evaluation agent and initial assessment</w:t>
+        <w:t>| * 8b216e6 (task-c-agent) feat: add theme-aware evaluation agent and initial assessment</w:t>
       </w:r>
     </w:p>
     <w:p>
@@ -2316,7 +2364,7 @@
           <w:rFonts w:ascii="Menlo" w:hAnsi="Menlo" w:eastAsia="Noto Serif CJK SC"/>
           <w:sz w:val="14"/>
         </w:rPr>
-        <w:t xml:space="preserve">|/  </w:t>
+        <w:t>|/</w:t>
       </w:r>
     </w:p>
     <w:p>
@@ -2340,7 +2388,7 @@
           <w:rFonts w:ascii="Menlo" w:hAnsi="Menlo" w:eastAsia="Noto Serif CJK SC"/>
           <w:sz w:val="14"/>
         </w:rPr>
-        <w:t xml:space="preserve">|\  </w:t>
+        <w:t>|\</w:t>
       </w:r>
     </w:p>
     <w:p>
@@ -2352,7 +2400,7 @@
           <w:rFonts w:ascii="Menlo" w:hAnsi="Menlo" w:eastAsia="Noto Serif CJK SC"/>
           <w:sz w:val="14"/>
         </w:rPr>
-        <w:t>| * 819ad98 fix: qualify finite placebo simulation and verify controlled skill comparison</w:t>
+        <w:t>| * 819ad98 (task-b-skill) fix: qualify finite placebo simulation and verify controlled skill comparison</w:t>
       </w:r>
     </w:p>
     <w:p>
@@ -2376,7 +2424,7 @@
           <w:rFonts w:ascii="Menlo" w:hAnsi="Menlo" w:eastAsia="Noto Serif CJK SC"/>
           <w:sz w:val="14"/>
         </w:rPr>
-        <w:t xml:space="preserve">|/  </w:t>
+        <w:t>|/</w:t>
       </w:r>
     </w:p>
     <w:p>
@@ -2400,7 +2448,7 @@
           <w:rFonts w:ascii="Menlo" w:hAnsi="Menlo" w:eastAsia="Noto Serif CJK SC"/>
           <w:sz w:val="14"/>
         </w:rPr>
-        <w:t xml:space="preserve">|\  </w:t>
+        <w:t>|\</w:t>
       </w:r>
     </w:p>
     <w:p>
@@ -2412,7 +2460,7 @@
           <w:rFonts w:ascii="Menlo" w:hAnsi="Menlo" w:eastAsia="Noto Serif CJK SC"/>
           <w:sz w:val="14"/>
         </w:rPr>
-        <w:t>| * 189c364 feat: execute DID robustness checks and resolve absorbed-control instability</w:t>
+        <w:t>| * 189c364 (task-a-robustness) feat: execute DID robustness checks and resolve absorbed-control instability</w:t>
       </w:r>
     </w:p>
     <w:p>
@@ -2436,7 +2484,7 @@
           <w:rFonts w:ascii="Menlo" w:hAnsi="Menlo" w:eastAsia="Noto Serif CJK SC"/>
           <w:sz w:val="14"/>
         </w:rPr>
-        <w:t xml:space="preserve">|/  </w:t>
+        <w:t>|/</w:t>
       </w:r>
     </w:p>
     <w:p>

</xml_diff>

<commit_message>
docs: unify submission date and refine coursework wording
</commit_message>
<xml_diff>
--- a/submission/纸质提交材料.docx
+++ b/submission/纸质提交材料.docx
@@ -268,7 +268,7 @@
                 <w:rFonts w:eastAsia="Noto Serif CJK SC" w:ascii="Noto Serif CJK SC" w:hAnsi="Noto Serif CJK SC"/>
                 <w:sz w:val="20"/>
               </w:rPr>
-              <w:t>2026-09-04</w:t>
+              <w:t>2026年8月26日</w:t>
             </w:r>
           </w:p>
         </w:tc>
@@ -589,7 +589,7 @@
           <w:rFonts w:eastAsia="Noto Serif CJK SC" w:ascii="Noto Serif CJK SC" w:hAnsi="Noto Serif CJK SC"/>
           <w:sz w:val="18"/>
         </w:rPr>
-        <w:t>本材料由Codex辅助分析与草拟，记录以实际文件和执行证据为准；署名研究者提交前复核。</w:t>
+        <w:t>工具使用：Codex用于程序编写与执行、结果解读和文本起草，具体操作及修订依据见audit-log.md。</w:t>
       </w:r>
     </w:p>
     <w:p>
@@ -1354,7 +1354,7 @@
         <w:rPr>
           <w:rFonts w:eastAsia="Noto Serif CJK SC" w:ascii="Noto Serif CJK SC" w:hAnsi="Noto Serif CJK SC"/>
         </w:rPr>
-        <w:t>差异的本质：把需重复提醒的验证条件写入程序和制度，不以更显著的数字证明Skill有效。裸Prompt已有完整随机分布，不虚构“原版什么都没有”的对照。</w:t>
+        <w:t>本轮将有限模拟的解释要求写入Skill和程序。裸Prompt已保存完整随机分布，修订后新增平滑比例和概率上界；回归结果保持一致。</w:t>
       </w:r>
     </w:p>
     <w:p>
@@ -1838,7 +1838,7 @@
         <w:rPr>
           <w:rFonts w:eastAsia="Noto Serif CJK SC" w:ascii="Noto Serif CJK SC" w:hAnsi="Noto Serif CJK SC"/>
         </w:rPr>
-        <w:t>实现说明：本次由Codex按照Agent文件完成语义评估，evaluate.py进行确定性校验和装配；未声称调用独立外部模型。通用Agent说明与课程项目适配脚本分开，迁移时需重新配置输入及主题内容。</w:t>
+        <w:t>实现方式：Codex按Agent说明解读结果，evaluate.py负责输入校验和报告生成。通用Agent说明与课程适配脚本分别保存，迁移时需重新配置输入并调整主题解释。</w:t>
       </w:r>
     </w:p>
     <w:p>
@@ -1921,7 +1921,7 @@
         <w:rPr>
           <w:rFonts w:eastAsia="Noto Serif CJK SC" w:ascii="Noto Serif CJK SC" w:hAnsi="Noto Serif CJK SC"/>
         </w:rPr>
-        <w:t>观察问题：在临时副本删除事件文件、改基准、删短窗口规格、令p=1.2，初版校验仍接受；只有重复行被识别。六例含一个正常样本，初版仅2/6符合预期。这里没有捏造AI先前说过的话，证据是实际程序行为。</w:t>
+        <w:t>观察问题：在临时副本删除事件文件、改基准、删短窗口规格、令p=1.2，初版校验仍接受；只有重复行被识别。六例含一个正常样本，初版仅2/6符合预期。测试结果保存在agent_v1_tests.json，可逐项核对。</w:t>
       </w:r>
     </w:p>
     <w:p>
@@ -1973,7 +1973,7 @@
         <w:rPr>
           <w:rFonts w:eastAsia="Noto Serif CJK SC" w:ascii="Noto Serif CJK SC" w:hAnsi="Noto Serif CJK SC"/>
         </w:rPr>
-        <w:t>需要改变的不是让AI说得更谨慎，而是让关键判断有可执行的依据。下一次研究应先定义估计对象和异常退出条件，再运行模型；保留不利结果、实际失败和版本差异，才能解释输出为何值得相信。仍需人工复核经济语义与研究假设，测试通过不是因果证明。</w:t>
+        <w:t>两轮修订分别补充了有限模拟解释和输入错误检查。后续研究应先明确估计对象、验证指标与停止条件，再运行模型。程序可以核对数字和文件，却不能替代对变量含义及识别假设的判断；不显著结果和失败记录也应保留。</w:t>
       </w:r>
     </w:p>
     <w:p>
@@ -2194,7 +2194,7 @@
                 <w:rFonts w:eastAsia="Noto Serif CJK SC" w:ascii="Noto Serif CJK SC" w:hAnsi="Noto Serif CJK SC"/>
                 <w:sz w:val="20"/>
               </w:rPr>
-              <w:t>把实际尝试、拒绝的输出、修复和最终证据对应到版本；已有历史来自本次工作，不复制同学历史，不补造旧日期。</w:t>
+              <w:t>通过提交记录定位每次尝试、异常输出和修复，便于比较修改前后的结果并恢复旧版本。</w:t>
             </w:r>
           </w:p>
         </w:tc>
@@ -3460,7 +3460,7 @@
         <w:rPr>
           <w:rFonts w:eastAsia="Noto Serif CJK SC" w:ascii="Noto Serif CJK SC" w:hAnsi="Noto Serif CJK SC"/>
         </w:rPr>
-        <w:t>论文与纸质材料均保留合成数据边界。材料中没有虚构现实数据、参考文献、独立模型调用或GitHub地址；提交前需将本人真实仓库链接填入封面，确认内容后打印。</w:t>
+        <w:t>提交前需将实际GitHub仓库链接填入封面，核对电子文件与打印稿一致。论文结果适用于本次合成数据演示。</w:t>
       </w:r>
     </w:p>
     <w:sectPr>

</xml_diff>

<commit_message>
docs: fill GitHub repository link and prepare final upload
</commit_message>
<xml_diff>
--- a/submission/纸质提交材料.docx
+++ b/submission/纸质提交材料.docx
@@ -229,7 +229,7 @@
                 <w:rFonts w:eastAsia="Noto Serif CJK SC" w:ascii="Noto Serif CJK SC" w:hAnsi="Noto Serif CJK SC"/>
                 <w:sz w:val="20"/>
               </w:rPr>
-              <w:t>待本人创建仓库后填写</w:t>
+              <w:t>https://github.com/LucasMoore-77/did-homework-denghongqi</w:t>
             </w:r>
           </w:p>
         </w:tc>
@@ -2505,7 +2505,7 @@
           <w:rFonts w:eastAsia="Noto Serif CJK SC" w:ascii="Noto Serif CJK SC" w:hAnsi="Noto Serif CJK SC"/>
           <w:sz w:val="18"/>
         </w:rPr>
-        <w:t>快照保存于生成材料时；后续提交以仓库 git log --oneline --graph --all 为准。远程仓库由本人最后创建并推送。</w:t>
+        <w:t>快照保存于生成材料时；后续提交以仓库 git log --oneline --graph --all 为准。远程仓库已创建，待本人推送完整历史。</w:t>
       </w:r>
     </w:p>
     <w:p>
@@ -3413,7 +3413,7 @@
                 <w:rFonts w:eastAsia="Noto Serif CJK SC" w:ascii="Noto Serif CJK SC" w:hAnsi="Noto Serif CJK SC"/>
                 <w:sz w:val="20"/>
               </w:rPr>
-              <w:t>按GITHUB_UPLOAD.md操作</w:t>
+              <w:t>封面链接已填；按GITHUB_UPLOAD.md推送</w:t>
             </w:r>
           </w:p>
         </w:tc>
@@ -3430,7 +3430,7 @@
                 <w:rFonts w:eastAsia="Noto Serif CJK SC" w:ascii="Noto Serif CJK SC" w:hAnsi="Noto Serif CJK SC"/>
                 <w:sz w:val="20"/>
               </w:rPr>
-              <w:t>待本人完成</w:t>
+              <w:t>待推送</w:t>
             </w:r>
           </w:p>
         </w:tc>
@@ -3460,7 +3460,7 @@
         <w:rPr>
           <w:rFonts w:eastAsia="Noto Serif CJK SC" w:ascii="Noto Serif CJK SC" w:hAnsi="Noto Serif CJK SC"/>
         </w:rPr>
-        <w:t>提交前需将实际GitHub仓库链接填入封面，核对电子文件与打印稿一致。论文结果适用于本次合成数据演示。</w:t>
+        <w:t>封面已填写实际GitHub仓库链接。提交前完成远程推送，并核对电子文件与打印稿一致。论文结果适用于本次合成数据演示。</w:t>
       </w:r>
     </w:p>
     <w:sectPr>

</xml_diff>